<commit_message>
Cambio identificatori pericopi: seguo 3951/7.1 piuttosto che 3293.11
</commit_message>
<xml_diff>
--- a/Materiali/Morfologia cpl (30.05.2021) + GD[8363].docx
+++ b/Materiali/Morfologia cpl (30.05.2021) + GD[8363].docx
@@ -54,8 +54,13 @@
             <w:r>
               <w:t>&gt;</w:t>
             </w:r>
+            <w:proofErr w:type="gramStart"/>
             <w:r>
-              <w:t>&gt;  Pericope “critica” con indicazioni sulla struttura del testo e argomentativa</w:t>
+              <w:t>&gt;  Pericope</w:t>
+            </w:r>
+            <w:proofErr w:type="gramEnd"/>
+            <w:r>
+              <w:t xml:space="preserve"> “critica” con indicazioni sulla struttura del testo e argomentativa</w:t>
             </w:r>
           </w:p>
           <w:p/>
@@ -64,10 +69,21 @@
               <w:rPr>
                 <w:highlight w:val="cyan"/>
               </w:rPr>
-              <w:t>Esempio linguistico</w:t>
+              <w:t xml:space="preserve">Esempio </w:t>
+            </w:r>
+            <w:proofErr w:type="gramStart"/>
+            <w:r>
+              <w:rPr>
+                <w:highlight w:val="cyan"/>
+              </w:rPr>
+              <w:t>linguistico</w:t>
             </w:r>
             <w:r>
-              <w:t xml:space="preserve"> : “</w:t>
+              <w:t xml:space="preserve"> :</w:t>
+            </w:r>
+            <w:proofErr w:type="gramEnd"/>
+            <w:r>
+              <w:t xml:space="preserve"> “</w:t>
             </w:r>
             <w:r>
               <w:rPr>
@@ -247,7 +263,21 @@
         <w:rPr>
           <w:rFonts w:ascii="Times New Roman" w:hAnsi="Times New Roman"/>
         </w:rPr>
-        <w:t>Tipo: Lezioni, destinato a studenti.</w:t>
+        <w:t xml:space="preserve">Tipo: Lezioni, destinato </w:t>
+      </w:r>
+      <w:proofErr w:type="gramStart"/>
+      <w:r>
+        <w:rPr>
+          <w:rFonts w:ascii="Times New Roman" w:hAnsi="Times New Roman"/>
+        </w:rPr>
+        <w:t>a studenti</w:t>
+      </w:r>
+      <w:proofErr w:type="gramEnd"/>
+      <w:r>
+        <w:rPr>
+          <w:rFonts w:ascii="Times New Roman" w:hAnsi="Times New Roman"/>
+        </w:rPr>
+        <w:t>.</w:t>
       </w:r>
       <w:r>
         <w:rPr>
@@ -383,7 +413,14 @@
         <w:rPr>
           <w:rFonts w:ascii="Times New Roman" w:hAnsi="Times New Roman"/>
         </w:rPr>
-        <w:t xml:space="preserve"> sulla divisione in paragrafi.</w:t>
+        <w:t xml:space="preserve"> sulla divisione in </w:t>
+      </w:r>
+      <w:proofErr w:type="gramStart"/>
+      <w:r>
+        <w:rPr>
+          <w:rFonts w:ascii="Times New Roman" w:hAnsi="Times New Roman"/>
+        </w:rPr>
+        <w:t>paragrafi.</w:t>
       </w:r>
       <w:r>
         <w:rPr>
@@ -391,6 +428,7 @@
         </w:rPr>
         <w:t>.</w:t>
       </w:r>
+      <w:proofErr w:type="gramEnd"/>
     </w:p>
     <w:p>
       <w:pPr>
@@ -411,6 +449,7 @@
         </w:rPr>
         <w:t>Manoscritto: la bella copia BGE Ms. fr. 3951/7 pp. 1-</w:t>
       </w:r>
+      <w:proofErr w:type="gramStart"/>
       <w:r>
         <w:rPr>
           <w:rFonts w:ascii="Times New Roman" w:hAnsi="Times New Roman"/>
@@ -421,7 +460,14 @@
         <w:rPr>
           <w:rFonts w:ascii="Times New Roman" w:hAnsi="Times New Roman"/>
         </w:rPr>
-        <w:t xml:space="preserve">  (la brutta copia Ms. fr. 3951/7 pp.</w:t>
+        <w:t xml:space="preserve">  (</w:t>
+      </w:r>
+      <w:proofErr w:type="gramEnd"/>
+      <w:r>
+        <w:rPr>
+          <w:rFonts w:ascii="Times New Roman" w:hAnsi="Times New Roman"/>
+        </w:rPr>
+        <w:t>la brutta copia Ms. fr. 3951/7 pp.</w:t>
       </w:r>
       <w:r>
         <w:rPr>
@@ -572,7 +618,14 @@
         <w:rPr>
           <w:rFonts w:ascii="Times New Roman" w:hAnsi="Times New Roman"/>
         </w:rPr>
-        <w:t xml:space="preserve">, pp. ...;  </w:t>
+        <w:t xml:space="preserve">, pp. </w:t>
+      </w:r>
+      <w:proofErr w:type="gramStart"/>
+      <w:r>
+        <w:rPr>
+          <w:rFonts w:ascii="Times New Roman" w:hAnsi="Times New Roman"/>
+        </w:rPr>
+        <w:t xml:space="preserve">...;  </w:t>
       </w:r>
       <w:commentRangeStart w:id="0"/>
       <w:r>
@@ -581,7 +634,16 @@
           <w:b/>
           <w:bCs/>
         </w:rPr>
-        <w:t>Engler 1967-74</w:t>
+        <w:t>Engler</w:t>
+      </w:r>
+      <w:proofErr w:type="gramEnd"/>
+      <w:r>
+        <w:rPr>
+          <w:rFonts w:ascii="Times New Roman" w:hAnsi="Times New Roman"/>
+          <w:b/>
+          <w:bCs/>
+        </w:rPr>
+        <w:t xml:space="preserve"> 1967-74</w:t>
       </w:r>
       <w:r>
         <w:rPr>
@@ -801,6 +863,7 @@
     </w:p>
     <w:p>
       <w:pPr>
+        <w:shd w:val="clear" w:color="auto" w:fill="DEEAF6" w:themeFill="accent5" w:themeFillTint="33"/>
         <w:rPr>
           <w:rFonts w:ascii="Times New Roman" w:hAnsi="Times New Roman"/>
         </w:rPr>
@@ -872,6 +935,7 @@
     </w:p>
     <w:p>
       <w:pPr>
+        <w:shd w:val="clear" w:color="auto" w:fill="E2EFD9" w:themeFill="accent6" w:themeFillTint="33"/>
         <w:rPr>
           <w:rFonts w:ascii="Times New Roman" w:hAnsi="Times New Roman"/>
         </w:rPr>
@@ -948,6 +1012,7 @@
     </w:p>
     <w:p>
       <w:pPr>
+        <w:shd w:val="clear" w:color="auto" w:fill="E2EFD9" w:themeFill="accent6" w:themeFillTint="33"/>
         <w:rPr>
           <w:rFonts w:ascii="Times New Roman" w:hAnsi="Times New Roman"/>
         </w:rPr>
@@ -1010,6 +1075,7 @@
     </w:p>
     <w:p>
       <w:pPr>
+        <w:shd w:val="clear" w:color="auto" w:fill="FFF2CC" w:themeFill="accent4" w:themeFillTint="33"/>
         <w:rPr>
           <w:rFonts w:ascii="Times New Roman" w:hAnsi="Times New Roman"/>
         </w:rPr>
@@ -1093,6 +1159,7 @@
     </w:p>
     <w:p>
       <w:pPr>
+        <w:shd w:val="clear" w:color="auto" w:fill="EDEDED" w:themeFill="accent3" w:themeFillTint="33"/>
         <w:rPr>
           <w:rFonts w:ascii="Times New Roman" w:hAnsi="Times New Roman"/>
         </w:rPr>
@@ -1227,6 +1294,12 @@
           <w:rFonts w:ascii="Times New Roman" w:hAnsi="Times New Roman"/>
         </w:rPr>
         <w:tab/>
+      </w:r>
+      <w:r>
+        <w:rPr>
+          <w:rFonts w:ascii="Times New Roman" w:hAnsi="Times New Roman"/>
+          <w:shd w:val="clear" w:color="auto" w:fill="EDEDED" w:themeFill="accent3" w:themeFillTint="33"/>
+        </w:rPr>
         <w:t>p. 3, zona 1</w:t>
       </w:r>
     </w:p>
@@ -2776,7 +2849,21 @@
           <w:rFonts w:ascii="Times New Roman" w:hAnsi="Times New Roman"/>
         </w:rPr>
         <w:tab/>
-        <w:t>&lt;&lt;Ms. fr. 3951/7 p. 2 1a zona&gt;&gt;</w:t>
+        <w:t xml:space="preserve">&lt;&lt;Ms. fr. 3951/7 p. 2 </w:t>
+      </w:r>
+      <w:proofErr w:type="gramStart"/>
+      <w:r>
+        <w:rPr>
+          <w:rFonts w:ascii="Times New Roman" w:hAnsi="Times New Roman"/>
+        </w:rPr>
+        <w:t>1a</w:t>
+      </w:r>
+      <w:proofErr w:type="gramEnd"/>
+      <w:r>
+        <w:rPr>
+          <w:rFonts w:ascii="Times New Roman" w:hAnsi="Times New Roman"/>
+        </w:rPr>
+        <w:t xml:space="preserve"> zona&gt;&gt;</w:t>
       </w:r>
     </w:p>
     <w:p>
@@ -2991,7 +3078,19 @@
           <w:rFonts w:ascii="Times New Roman" w:hAnsi="Times New Roman"/>
         </w:rPr>
         <w:tab/>
-        <w:t>&lt;&lt;def.2, specifica&gt;&gt;  Definizione. La morfologia è la scienza che tratta delle unità di suono corrispondenti a una parte dell’idea, e del raggruppamento di tali unità. La fonetica è la scienza che tratta delle unità di suono da stabilirsi in base a caratteri fisiologici e acustici.</w:t>
+        <w:t xml:space="preserve">&lt;&lt;def.2, specifica&gt;&gt; </w:t>
+      </w:r>
+      <w:r>
+        <w:rPr>
+          <w:rFonts w:ascii="Times New Roman" w:hAnsi="Times New Roman"/>
+        </w:rPr>
+        <w:t>D</w:t>
+      </w:r>
+      <w:r>
+        <w:rPr>
+          <w:rFonts w:ascii="Times New Roman" w:hAnsi="Times New Roman"/>
+        </w:rPr>
+        <w:t>efinizione. La morfologia è la scienza che tratta delle unità di suono corrispondenti a una parte dell’idea, e del raggruppamento di tali unità. La fonetica è la scienza che tratta delle unità di suono da stabilirsi in base a caratteri fisiologici e acustici.</w:t>
       </w:r>
     </w:p>
     <w:p>
@@ -3794,12 +3893,21 @@
         </w:rPr>
         <w:tab/>
       </w:r>
-      <w:r>
-        <w:rPr>
-          <w:rFonts w:ascii="Times New Roman" w:hAnsi="Times New Roman"/>
-          <w:lang w:val="fr-FR"/>
-        </w:rPr>
-        <w:t>men-eur, os-eur, recommenc-eur</w:t>
+      <w:proofErr w:type="gramStart"/>
+      <w:r>
+        <w:rPr>
+          <w:rFonts w:ascii="Times New Roman" w:hAnsi="Times New Roman"/>
+          <w:lang w:val="fr-FR"/>
+        </w:rPr>
+        <w:t>men</w:t>
+      </w:r>
+      <w:proofErr w:type="gramEnd"/>
+      <w:r>
+        <w:rPr>
+          <w:rFonts w:ascii="Times New Roman" w:hAnsi="Times New Roman"/>
+          <w:lang w:val="fr-FR"/>
+        </w:rPr>
+        <w:t>-eur, os-eur, recommenc-eur</w:t>
       </w:r>
     </w:p>
     <w:p>
@@ -3872,11 +3980,19 @@
           <w:rFonts w:ascii="Times New Roman" w:hAnsi="Times New Roman"/>
         </w:rPr>
       </w:pPr>
-      <w:r>
-        <w:rPr>
-          <w:rFonts w:ascii="Times New Roman" w:hAnsi="Times New Roman"/>
-        </w:rPr>
-        <w:t>graveur : graver, je grave = x : oser, j’ose.</w:t>
+      <w:proofErr w:type="gramStart"/>
+      <w:r>
+        <w:rPr>
+          <w:rFonts w:ascii="Times New Roman" w:hAnsi="Times New Roman"/>
+        </w:rPr>
+        <w:t>graveur :</w:t>
+      </w:r>
+      <w:proofErr w:type="gramEnd"/>
+      <w:r>
+        <w:rPr>
+          <w:rFonts w:ascii="Times New Roman" w:hAnsi="Times New Roman"/>
+        </w:rPr>
+        <w:t xml:space="preserve"> graver, je grave = x : oser, j’ose.</w:t>
       </w:r>
     </w:p>
     <w:p>
@@ -3906,39 +4022,78 @@
           <w:rFonts w:ascii="Times New Roman" w:hAnsi="Times New Roman"/>
         </w:rPr>
       </w:pPr>
-      <w:r>
-        <w:rPr>
-          <w:rFonts w:ascii="Times New Roman" w:hAnsi="Times New Roman"/>
-        </w:rPr>
-        <w:t>δόσις : δοτός = στάσις : στατός</w:t>
-      </w:r>
-    </w:p>
-    <w:p>
-      <w:pPr>
-        <w:rPr>
-          <w:rFonts w:ascii="Times New Roman" w:hAnsi="Times New Roman"/>
-        </w:rPr>
-      </w:pPr>
-      <w:r>
-        <w:rPr>
-          <w:rFonts w:ascii="Times New Roman" w:hAnsi="Times New Roman"/>
-        </w:rPr>
-        <w:t>Dunque io isolo -σις o -τός o δό-. Dunque io potrei formare eventualmente λύσις (λυτός). Chi potrebbe mai dire se non è esattamente in questo o quel modo che procede il sentimento della lingua?</w:t>
-      </w:r>
-    </w:p>
-    <w:p>
-      <w:pPr>
-        <w:rPr>
-          <w:rFonts w:ascii="Times New Roman" w:hAnsi="Times New Roman"/>
-          <w:lang w:val="fr-FR"/>
-        </w:rPr>
-      </w:pPr>
-      <w:r>
-        <w:rPr>
-          <w:rFonts w:ascii="Times New Roman" w:hAnsi="Times New Roman"/>
-          <w:lang w:val="fr-FR"/>
-        </w:rPr>
-        <w:t>graveur : graver = penseur : penser</w:t>
+      <w:proofErr w:type="gramStart"/>
+      <w:r>
+        <w:rPr>
+          <w:rFonts w:ascii="Times New Roman" w:hAnsi="Times New Roman"/>
+        </w:rPr>
+        <w:t>δόσις :</w:t>
+      </w:r>
+      <w:proofErr w:type="gramEnd"/>
+      <w:r>
+        <w:rPr>
+          <w:rFonts w:ascii="Times New Roman" w:hAnsi="Times New Roman"/>
+        </w:rPr>
+        <w:t xml:space="preserve"> δοτός = στάσις : στατός</w:t>
+      </w:r>
+    </w:p>
+    <w:p>
+      <w:pPr>
+        <w:rPr>
+          <w:rFonts w:ascii="Times New Roman" w:hAnsi="Times New Roman"/>
+        </w:rPr>
+      </w:pPr>
+      <w:proofErr w:type="gramStart"/>
+      <w:r>
+        <w:rPr>
+          <w:rFonts w:ascii="Times New Roman" w:hAnsi="Times New Roman"/>
+        </w:rPr>
+        <w:t>Dunque</w:t>
+      </w:r>
+      <w:proofErr w:type="gramEnd"/>
+      <w:r>
+        <w:rPr>
+          <w:rFonts w:ascii="Times New Roman" w:hAnsi="Times New Roman"/>
+        </w:rPr>
+        <w:t xml:space="preserve"> io isolo -σις o -τός o δό-. </w:t>
+      </w:r>
+      <w:proofErr w:type="gramStart"/>
+      <w:r>
+        <w:rPr>
+          <w:rFonts w:ascii="Times New Roman" w:hAnsi="Times New Roman"/>
+        </w:rPr>
+        <w:t>Dunque</w:t>
+      </w:r>
+      <w:proofErr w:type="gramEnd"/>
+      <w:r>
+        <w:rPr>
+          <w:rFonts w:ascii="Times New Roman" w:hAnsi="Times New Roman"/>
+        </w:rPr>
+        <w:t xml:space="preserve"> io potrei formare eventualmente λύσις (λυτός). Chi potrebbe mai dire se non è esattamente in questo o quel modo che procede il sentimento della lingua?</w:t>
+      </w:r>
+    </w:p>
+    <w:p>
+      <w:pPr>
+        <w:rPr>
+          <w:rFonts w:ascii="Times New Roman" w:hAnsi="Times New Roman"/>
+          <w:lang w:val="fr-FR"/>
+        </w:rPr>
+      </w:pPr>
+      <w:proofErr w:type="gramStart"/>
+      <w:r>
+        <w:rPr>
+          <w:rFonts w:ascii="Times New Roman" w:hAnsi="Times New Roman"/>
+          <w:lang w:val="fr-FR"/>
+        </w:rPr>
+        <w:t>graveur</w:t>
+      </w:r>
+      <w:proofErr w:type="gramEnd"/>
+      <w:r>
+        <w:rPr>
+          <w:rFonts w:ascii="Times New Roman" w:hAnsi="Times New Roman"/>
+          <w:lang w:val="fr-FR"/>
+        </w:rPr>
+        <w:t xml:space="preserve"> : graver = penseur : penser</w:t>
       </w:r>
     </w:p>
     <w:p>
@@ -4138,11 +4293,19 @@
           <w:rFonts w:ascii="Times New Roman" w:hAnsi="Times New Roman"/>
         </w:rPr>
       </w:pPr>
-      <w:r>
-        <w:rPr>
-          <w:rFonts w:ascii="Times New Roman" w:hAnsi="Times New Roman"/>
-        </w:rPr>
-        <w:t>Kalb : kalbir. Se faccio intervenire nelle forme del nono secolo ciò che era vero di quelle del primo secolo, se dico: No, -ir n</w:t>
+      <w:proofErr w:type="gramStart"/>
+      <w:r>
+        <w:rPr>
+          <w:rFonts w:ascii="Times New Roman" w:hAnsi="Times New Roman"/>
+        </w:rPr>
+        <w:t>Kalb :</w:t>
+      </w:r>
+      <w:proofErr w:type="gramEnd"/>
+      <w:r>
+        <w:rPr>
+          <w:rFonts w:ascii="Times New Roman" w:hAnsi="Times New Roman"/>
+        </w:rPr>
+        <w:t xml:space="preserve"> kalbir. Se faccio intervenire nelle forme del nono secolo ciò che era vero di quelle del primo secolo, se dico: No, -ir n</w:t>
       </w:r>
       <w:r>
         <w:rPr>
@@ -4511,7 +4674,21 @@
         <w:rPr>
           <w:rFonts w:ascii="Times New Roman" w:hAnsi="Times New Roman"/>
         </w:rPr>
-        <w:t>analisi retrospettiva. L’analisi contemporanea sarebbe: pat-ercus. Prova: nuova formazione: nov-erca, che dimostra che si isolava pat + ercus, e non pater + cus. L’analisi retrospettiva non tende che a suddividere i membri della parola secondo l’analisi più antica della lingua; ma quest’analisi non risponde all’analisi più recente se non in un numero limitato di casi. D’altra parte, può perfettamente rispondervi, e anche questo non dobbiamo dimenticarlo:</w:t>
+        <w:t xml:space="preserve">analisi retrospettiva. L’analisi contemporanea sarebbe: pat-ercus. Prova: nuova formazione: nov-erca, che dimostra che si isolava pat + ercus, e non pater + cus. L’analisi retrospettiva non tende che a suddividere i membri della parola secondo l’analisi più antica della </w:t>
+      </w:r>
+      <w:proofErr w:type="gramStart"/>
+      <w:r>
+        <w:rPr>
+          <w:rFonts w:ascii="Times New Roman" w:hAnsi="Times New Roman"/>
+        </w:rPr>
+        <w:t>lingua;</w:t>
+      </w:r>
+      <w:proofErr w:type="gramEnd"/>
+      <w:r>
+        <w:rPr>
+          <w:rFonts w:ascii="Times New Roman" w:hAnsi="Times New Roman"/>
+        </w:rPr>
+        <w:t xml:space="preserve"> ma quest’analisi non risponde all’analisi più recente se non in un numero limitato di casi. D’altra parte, può perfettamente rispondervi, e anche questo non dobbiamo dimenticarlo:</w:t>
       </w:r>
     </w:p>
     <w:p>
@@ -4752,7 +4929,21 @@
         <w:rPr>
           <w:rFonts w:ascii="Times New Roman" w:hAnsi="Times New Roman"/>
         </w:rPr>
-        <w:t>diverse epoche e di penetrarsi esclusivamente dello spirito di ognuna di esse, di non imporre alle forme storiche un quadro abolito da secoli. Soltanto, in questo modo non si avrebbe che un’idea molto incompleta sulla genesi di quelle forme. È chiaro che se io dividessi pat-ercus, conformemente al sentimento latino di una certa data, non ravviserei il parallelismo tra pater : pater – cus e villa : villi</w:t>
+        <w:t xml:space="preserve">diverse epoche e di penetrarsi esclusivamente dello spirito di ognuna di esse, di non imporre alle forme storiche un quadro abolito da secoli. Soltanto, in questo modo non si avrebbe che un’idea molto incompleta sulla genesi di quelle forme. È chiaro che se io dividessi pat-ercus, conformemente al sentimento latino di una certa data, non ravviserei il parallelismo tra </w:t>
+      </w:r>
+      <w:proofErr w:type="gramStart"/>
+      <w:r>
+        <w:rPr>
+          <w:rFonts w:ascii="Times New Roman" w:hAnsi="Times New Roman"/>
+        </w:rPr>
+        <w:t>pater :</w:t>
+      </w:r>
+      <w:proofErr w:type="gramEnd"/>
+      <w:r>
+        <w:rPr>
+          <w:rFonts w:ascii="Times New Roman" w:hAnsi="Times New Roman"/>
+        </w:rPr>
+        <w:t xml:space="preserve"> pater – cus e villa : villi</w:t>
       </w:r>
       <w:r>
         <w:rPr>
@@ -4782,7 +4973,21 @@
         <w:rPr>
           <w:rFonts w:ascii="Times New Roman" w:hAnsi="Times New Roman"/>
         </w:rPr>
-        <w:t>La pratica comanda dunque l’anacronismo e la confusione delle epoche.</w:t>
+        <w:t xml:space="preserve">La pratica </w:t>
+      </w:r>
+      <w:proofErr w:type="gramStart"/>
+      <w:r>
+        <w:rPr>
+          <w:rFonts w:ascii="Times New Roman" w:hAnsi="Times New Roman"/>
+        </w:rPr>
+        <w:t>comanda dunque</w:t>
+      </w:r>
+      <w:proofErr w:type="gramEnd"/>
+      <w:r>
+        <w:rPr>
+          <w:rFonts w:ascii="Times New Roman" w:hAnsi="Times New Roman"/>
+        </w:rPr>
+        <w:t xml:space="preserve"> l’anacronismo e la confusione delle epoche.</w:t>
       </w:r>
     </w:p>
     <w:p>
@@ -5947,6 +6152,7 @@
           <w:rFonts w:ascii="Times New Roman" w:hAnsi="Times New Roman"/>
         </w:rPr>
       </w:pPr>
+      <w:proofErr w:type="gramStart"/>
       <w:r>
         <w:rPr>
           <w:rFonts w:ascii="Times New Roman" w:hAnsi="Times New Roman" w:cs="Times New Roman"/>
@@ -5960,6 +6166,7 @@
         </w:rPr>
         <w:t>:</w:t>
       </w:r>
+      <w:proofErr w:type="gramEnd"/>
       <w:r>
         <w:rPr>
           <w:rFonts w:ascii="Times New Roman" w:hAnsi="Times New Roman" w:cs="Times New Roman"/>
@@ -6100,7 +6307,21 @@
         <w:rPr>
           <w:rFonts w:ascii="Times New Roman" w:hAnsi="Times New Roman" w:cs="Times New Roman"/>
         </w:rPr>
-        <w:t xml:space="preserve">gradini si distruggono mano a mano che li si sale. Perché </w:t>
+        <w:t xml:space="preserve">gradini si distruggono </w:t>
+      </w:r>
+      <w:proofErr w:type="gramStart"/>
+      <w:r>
+        <w:rPr>
+          <w:rFonts w:ascii="Times New Roman" w:hAnsi="Times New Roman" w:cs="Times New Roman"/>
+        </w:rPr>
+        <w:t>mano</w:t>
+      </w:r>
+      <w:proofErr w:type="gramEnd"/>
+      <w:r>
+        <w:rPr>
+          <w:rFonts w:ascii="Times New Roman" w:hAnsi="Times New Roman" w:cs="Times New Roman"/>
+        </w:rPr>
+        <w:t xml:space="preserve"> a mano che li si sale. Perché </w:t>
       </w:r>
       <w:r>
         <w:rPr>
@@ -6306,6 +6527,7 @@
           <w:rFonts w:ascii="Times New Roman" w:hAnsi="Times New Roman" w:cs="Times New Roman"/>
         </w:rPr>
       </w:pPr>
+      <w:proofErr w:type="gramStart"/>
       <w:r>
         <w:rPr>
           <w:rFonts w:ascii="Times New Roman" w:hAnsi="Times New Roman" w:cs="Times New Roman"/>
@@ -6313,6 +6535,7 @@
         </w:rPr>
         <w:t>πότερος</w:t>
       </w:r>
+      <w:proofErr w:type="gramEnd"/>
       <w:r>
         <w:rPr>
           <w:rFonts w:ascii="Times New Roman" w:hAnsi="Times New Roman"/>
@@ -6380,6 +6603,7 @@
           <w:lang w:val="fr-FR"/>
         </w:rPr>
       </w:pPr>
+      <w:proofErr w:type="gramStart"/>
       <w:r>
         <w:rPr>
           <w:rFonts w:ascii="Times New Roman" w:hAnsi="Times New Roman" w:cs="Times New Roman"/>
@@ -6387,6 +6611,7 @@
         </w:rPr>
         <w:t>τοί</w:t>
       </w:r>
+      <w:proofErr w:type="gramEnd"/>
       <w:r>
         <w:rPr>
           <w:rFonts w:ascii="Times New Roman" w:hAnsi="Times New Roman"/>
@@ -6430,12 +6655,21 @@
           <w:lang w:val="fr-FR"/>
         </w:rPr>
       </w:pPr>
-      <w:r>
-        <w:rPr>
-          <w:rFonts w:ascii="Times New Roman" w:hAnsi="Times New Roman"/>
-          <w:lang w:val="fr-FR"/>
-        </w:rPr>
-        <w:t xml:space="preserve">né </w:t>
+      <w:proofErr w:type="gramStart"/>
+      <w:r>
+        <w:rPr>
+          <w:rFonts w:ascii="Times New Roman" w:hAnsi="Times New Roman"/>
+          <w:lang w:val="fr-FR"/>
+        </w:rPr>
+        <w:t>né</w:t>
+      </w:r>
+      <w:proofErr w:type="gramEnd"/>
+      <w:r>
+        <w:rPr>
+          <w:rFonts w:ascii="Times New Roman" w:hAnsi="Times New Roman"/>
+          <w:lang w:val="fr-FR"/>
+        </w:rPr>
+        <w:t xml:space="preserve"> </w:t>
       </w:r>
       <w:r>
         <w:rPr>
@@ -6478,6 +6712,7 @@
           <w:rFonts w:ascii="Times New Roman" w:hAnsi="Times New Roman"/>
         </w:rPr>
       </w:pPr>
+      <w:proofErr w:type="gramStart"/>
       <w:r>
         <w:rPr>
           <w:rFonts w:ascii="Times New Roman" w:hAnsi="Times New Roman" w:cs="Times New Roman"/>
@@ -6485,6 +6720,7 @@
         </w:rPr>
         <w:t>τοί</w:t>
       </w:r>
+      <w:proofErr w:type="gramEnd"/>
       <w:r>
         <w:rPr>
           <w:rFonts w:ascii="Times New Roman" w:hAnsi="Times New Roman"/>
@@ -6560,12 +6796,21 @@
           <w:lang w:val="fr-FR"/>
         </w:rPr>
       </w:pPr>
-      <w:r>
-        <w:rPr>
-          <w:rFonts w:ascii="Times New Roman" w:hAnsi="Times New Roman"/>
-          <w:lang w:val="fr-FR"/>
-        </w:rPr>
-        <w:t>toi klut</w:t>
+      <w:proofErr w:type="gramStart"/>
+      <w:r>
+        <w:rPr>
+          <w:rFonts w:ascii="Times New Roman" w:hAnsi="Times New Roman"/>
+          <w:lang w:val="fr-FR"/>
+        </w:rPr>
+        <w:t>toi</w:t>
+      </w:r>
+      <w:proofErr w:type="gramEnd"/>
+      <w:r>
+        <w:rPr>
+          <w:rFonts w:ascii="Times New Roman" w:hAnsi="Times New Roman"/>
+          <w:lang w:val="fr-FR"/>
+        </w:rPr>
+        <w:t xml:space="preserve"> klut</w:t>
       </w:r>
       <w:r>
         <w:rPr>
@@ -6589,6 +6834,7 @@
           <w:lang w:val="fr-FR"/>
         </w:rPr>
       </w:pPr>
+      <w:proofErr w:type="gramStart"/>
       <w:r>
         <w:rPr>
           <w:rFonts w:ascii="Times New Roman" w:hAnsi="Times New Roman" w:cs="Times New Roman"/>
@@ -6596,6 +6842,7 @@
         </w:rPr>
         <w:t>τοί</w:t>
       </w:r>
+      <w:proofErr w:type="gramEnd"/>
       <w:r>
         <w:rPr>
           <w:rFonts w:ascii="Times New Roman" w:hAnsi="Times New Roman"/>
@@ -6638,8 +6885,17 @@
           <w:rFonts w:ascii="Times New Roman" w:hAnsi="Times New Roman"/>
           <w:lang w:val="fr-FR"/>
         </w:rPr>
-        <w:t>(a</w:t>
-      </w:r>
+        <w:t>(</w:t>
+      </w:r>
+      <w:proofErr w:type="gramStart"/>
+      <w:r>
+        <w:rPr>
+          <w:rFonts w:ascii="Times New Roman" w:hAnsi="Times New Roman"/>
+          <w:lang w:val="fr-FR"/>
+        </w:rPr>
+        <w:t>a</w:t>
+      </w:r>
+      <w:proofErr w:type="gramEnd"/>
       <w:r>
         <w:rPr>
           <w:rFonts w:ascii="Times New Roman" w:hAnsi="Times New Roman"/>
@@ -7303,7 +7559,15 @@
           <w:rFonts w:ascii="Times New Roman" w:hAnsi="Times New Roman"/>
           <w:lang w:val="fr-FR"/>
         </w:rPr>
-        <w:t xml:space="preserve">, pas d' </w:t>
+        <w:t xml:space="preserve">, pas </w:t>
+      </w:r>
+      <w:proofErr w:type="gramStart"/>
+      <w:r>
+        <w:rPr>
+          <w:rFonts w:ascii="Times New Roman" w:hAnsi="Times New Roman"/>
+          <w:lang w:val="fr-FR"/>
+        </w:rPr>
+        <w:t xml:space="preserve">d' </w:t>
       </w:r>
       <w:r>
         <w:rPr>
@@ -7317,7 +7581,15 @@
           <w:rFonts w:ascii="Times New Roman" w:hAnsi="Times New Roman"/>
           <w:lang w:val="fr-FR"/>
         </w:rPr>
-        <w:t xml:space="preserve">γ-, je fais de la </w:t>
+        <w:t>γ</w:t>
+      </w:r>
+      <w:proofErr w:type="gramEnd"/>
+      <w:r>
+        <w:rPr>
+          <w:rFonts w:ascii="Times New Roman" w:hAnsi="Times New Roman"/>
+          <w:lang w:val="fr-FR"/>
+        </w:rPr>
+        <w:t xml:space="preserve">-, je fais de la </w:t>
       </w:r>
       <w:r>
         <w:rPr>
@@ -7742,12 +8014,21 @@
         </w:rPr>
         <w:tab/>
       </w:r>
-      <w:r>
-        <w:rPr>
-          <w:rFonts w:ascii="Times New Roman" w:hAnsi="Times New Roman"/>
-          <w:lang w:val="fr-FR"/>
-        </w:rPr>
-        <w:t xml:space="preserve">nouvel allemand </w:t>
+      <w:proofErr w:type="gramStart"/>
+      <w:r>
+        <w:rPr>
+          <w:rFonts w:ascii="Times New Roman" w:hAnsi="Times New Roman"/>
+          <w:lang w:val="fr-FR"/>
+        </w:rPr>
+        <w:t>nouvel</w:t>
+      </w:r>
+      <w:proofErr w:type="gramEnd"/>
+      <w:r>
+        <w:rPr>
+          <w:rFonts w:ascii="Times New Roman" w:hAnsi="Times New Roman"/>
+          <w:lang w:val="fr-FR"/>
+        </w:rPr>
+        <w:t xml:space="preserve"> allemand </w:t>
       </w:r>
       <w:r>
         <w:rPr>
@@ -7806,7 +8087,25 @@
           <w:highlight w:val="cyan"/>
           <w:lang w:val="fr-FR"/>
         </w:rPr>
-        <w:t>[tedesco]</w:t>
+        <w:t>[</w:t>
+      </w:r>
+      <w:proofErr w:type="gramStart"/>
+      <w:r>
+        <w:rPr>
+          <w:rFonts w:ascii="Times New Roman" w:hAnsi="Times New Roman"/>
+          <w:highlight w:val="cyan"/>
+          <w:lang w:val="fr-FR"/>
+        </w:rPr>
+        <w:t>tedesco</w:t>
+      </w:r>
+      <w:proofErr w:type="gramEnd"/>
+      <w:r>
+        <w:rPr>
+          <w:rFonts w:ascii="Times New Roman" w:hAnsi="Times New Roman"/>
+          <w:highlight w:val="cyan"/>
+          <w:lang w:val="fr-FR"/>
+        </w:rPr>
+        <w:t>]</w:t>
       </w:r>
     </w:p>
     <w:p>
@@ -8168,6 +8467,7 @@
         </w:rPr>
         <w:tab/>
       </w:r>
+      <w:proofErr w:type="gramStart"/>
       <w:r>
         <w:rPr>
           <w:rFonts w:ascii="Times New Roman" w:hAnsi="Times New Roman"/>
@@ -8176,6 +8476,7 @@
         </w:rPr>
         <w:t>phonétique</w:t>
       </w:r>
+      <w:proofErr w:type="gramEnd"/>
       <w:r>
         <w:rPr>
           <w:rFonts w:ascii="Times New Roman" w:hAnsi="Times New Roman"/>
@@ -8287,6 +8588,7 @@
         </w:rPr>
         <w:tab/>
       </w:r>
+      <w:proofErr w:type="gramStart"/>
       <w:r>
         <w:rPr>
           <w:rFonts w:ascii="Times New Roman" w:hAnsi="Times New Roman"/>
@@ -8296,6 +8598,7 @@
         </w:rPr>
         <w:t>chantre</w:t>
       </w:r>
+      <w:proofErr w:type="gramEnd"/>
       <w:r>
         <w:rPr>
           <w:rFonts w:ascii="Times New Roman" w:hAnsi="Times New Roman"/>
@@ -8364,6 +8667,7 @@
         </w:rPr>
         <w:tab/>
       </w:r>
+      <w:proofErr w:type="gramStart"/>
       <w:r>
         <w:rPr>
           <w:rFonts w:ascii="Times New Roman" w:hAnsi="Times New Roman"/>
@@ -8373,6 +8677,7 @@
         </w:rPr>
         <w:t>chantre</w:t>
       </w:r>
+      <w:proofErr w:type="gramEnd"/>
       <w:r>
         <w:rPr>
           <w:rFonts w:ascii="Times New Roman" w:hAnsi="Times New Roman"/>
@@ -8442,6 +8747,7 @@
         </w:rPr>
         <w:tab/>
       </w:r>
+      <w:proofErr w:type="gramStart"/>
       <w:r>
         <w:rPr>
           <w:rFonts w:ascii="Times New Roman" w:hAnsi="Times New Roman"/>
@@ -8450,6 +8756,7 @@
         </w:rPr>
         <w:t>φόρος</w:t>
       </w:r>
+      <w:proofErr w:type="gramEnd"/>
       <w:r>
         <w:rPr>
           <w:rFonts w:ascii="Times New Roman" w:hAnsi="Times New Roman"/>
@@ -8517,6 +8824,7 @@
         </w:rPr>
         <w:tab/>
       </w:r>
+      <w:proofErr w:type="gramStart"/>
       <w:r>
         <w:rPr>
           <w:rFonts w:ascii="Times New Roman" w:hAnsi="Times New Roman"/>
@@ -8525,6 +8833,7 @@
         </w:rPr>
         <w:t>φόρος</w:t>
       </w:r>
+      <w:proofErr w:type="gramEnd"/>
       <w:r>
         <w:rPr>
           <w:rFonts w:ascii="Times New Roman" w:hAnsi="Times New Roman"/>
@@ -8868,8 +9177,16 @@
           <w:lang w:val="fr-FR"/>
         </w:rPr>
         <w:tab/>
+      </w:r>
+      <w:proofErr w:type="gramStart"/>
+      <w:r>
+        <w:rPr>
+          <w:rFonts w:ascii="Times New Roman" w:hAnsi="Times New Roman"/>
+          <w:lang w:val="fr-FR"/>
+        </w:rPr>
         <w:t>coulchier</w:t>
       </w:r>
+      <w:proofErr w:type="gramEnd"/>
     </w:p>
     <w:p>
       <w:pPr>
@@ -9389,6 +9706,7 @@
         </w:rPr>
         <w:tab/>
       </w:r>
+      <w:proofErr w:type="gramStart"/>
       <w:r>
         <w:rPr>
           <w:rFonts w:ascii="Times New Roman" w:hAnsi="Times New Roman" w:cs="Times New Roman"/>
@@ -9396,6 +9714,7 @@
         </w:rPr>
         <w:t>α</w:t>
       </w:r>
+      <w:proofErr w:type="gramEnd"/>
       <w:r>
         <w:rPr>
           <w:rFonts w:ascii="Times New Roman" w:hAnsi="Times New Roman"/>
@@ -9750,12 +10069,21 @@
           <w:lang w:val="fr-FR"/>
         </w:rPr>
       </w:pPr>
-      <w:r>
-        <w:rPr>
-          <w:rFonts w:ascii="Times New Roman" w:hAnsi="Times New Roman"/>
-          <w:lang w:val="fr-FR"/>
-        </w:rPr>
-        <w:t xml:space="preserve">Ou : la </w:t>
+      <w:proofErr w:type="gramStart"/>
+      <w:r>
+        <w:rPr>
+          <w:rFonts w:ascii="Times New Roman" w:hAnsi="Times New Roman"/>
+          <w:lang w:val="fr-FR"/>
+        </w:rPr>
+        <w:t>Ou</w:t>
+      </w:r>
+      <w:proofErr w:type="gramEnd"/>
+      <w:r>
+        <w:rPr>
+          <w:rFonts w:ascii="Times New Roman" w:hAnsi="Times New Roman"/>
+          <w:lang w:val="fr-FR"/>
+        </w:rPr>
+        <w:t xml:space="preserve"> : la </w:t>
       </w:r>
       <w:r>
         <w:rPr>
@@ -10261,6 +10589,7 @@
         </w:rPr>
         <w:tab/>
       </w:r>
+      <w:proofErr w:type="gramStart"/>
       <w:r>
         <w:rPr>
           <w:rFonts w:ascii="Times New Roman" w:hAnsi="Times New Roman" w:cs="Times New Roman"/>
@@ -10268,6 +10597,7 @@
         </w:rPr>
         <w:t>β</w:t>
       </w:r>
+      <w:proofErr w:type="gramEnd"/>
       <w:r>
         <w:rPr>
           <w:rFonts w:ascii="Times New Roman" w:hAnsi="Times New Roman"/>
@@ -10469,7 +10799,22 @@
           <w:lang w:val="fr-FR"/>
         </w:rPr>
         <w:tab/>
-        <w:t>δο/τός</w:t>
+      </w:r>
+      <w:proofErr w:type="gramStart"/>
+      <w:r>
+        <w:rPr>
+          <w:rFonts w:ascii="Times New Roman" w:hAnsi="Times New Roman"/>
+          <w:lang w:val="fr-FR"/>
+        </w:rPr>
+        <w:t>δο</w:t>
+      </w:r>
+      <w:proofErr w:type="gramEnd"/>
+      <w:r>
+        <w:rPr>
+          <w:rFonts w:ascii="Times New Roman" w:hAnsi="Times New Roman"/>
+          <w:lang w:val="fr-FR"/>
+        </w:rPr>
+        <w:t>/τός</w:t>
       </w:r>
       <w:r>
         <w:rPr>
@@ -10777,12 +11122,21 @@
           <w:lang w:val="fr-FR"/>
         </w:rPr>
       </w:pPr>
-      <w:r>
-        <w:rPr>
-          <w:rFonts w:ascii="Times New Roman" w:hAnsi="Times New Roman"/>
-          <w:lang w:val="fr-FR"/>
-        </w:rPr>
-        <w:t>aient une existence réelle ; 2° qu 'on en fera usage cependant parce qu'on ne peut s'en passer pour la commodité de l'exposition mais que, bien entendu, il ne faut attacher à ces expressions que la valeur toute relative qu'elles comportent.</w:t>
+      <w:proofErr w:type="gramStart"/>
+      <w:r>
+        <w:rPr>
+          <w:rFonts w:ascii="Times New Roman" w:hAnsi="Times New Roman"/>
+          <w:lang w:val="fr-FR"/>
+        </w:rPr>
+        <w:t>aient</w:t>
+      </w:r>
+      <w:proofErr w:type="gramEnd"/>
+      <w:r>
+        <w:rPr>
+          <w:rFonts w:ascii="Times New Roman" w:hAnsi="Times New Roman"/>
+          <w:lang w:val="fr-FR"/>
+        </w:rPr>
+        <w:t xml:space="preserve"> une existence réelle ; 2° qu 'on en fera usage cependant parce qu'on ne peut s'en passer pour la commodité de l'exposition mais que, bien entendu, il ne faut attacher à ces expressions que la valeur toute relative qu'elles comportent.</w:t>
       </w:r>
     </w:p>
     <w:p>
@@ -10843,7 +11197,23 @@
           <w:rFonts w:ascii="Times New Roman" w:hAnsi="Times New Roman"/>
           <w:lang w:val="fr-FR"/>
         </w:rPr>
-        <w:t xml:space="preserve"> mérite effectivement ce reproche d'avoir reconnu la nature des phénomènes et d'être restée jusqu'à un certain point embarrassée dans l'appareil scientifique de ses prédécesseurs, dont il était plus facile de faire voir les défauts que de fixer exactement la valeur positive. </w:t>
+        <w:t xml:space="preserve"> mérite effectivement ce reproche d'avoir reconnu la nature des phénomènes et d'être restée jusqu'à </w:t>
+      </w:r>
+      <w:proofErr w:type="gramStart"/>
+      <w:r>
+        <w:rPr>
+          <w:rFonts w:ascii="Times New Roman" w:hAnsi="Times New Roman"/>
+          <w:lang w:val="fr-FR"/>
+        </w:rPr>
+        <w:t>un certain point embarrassée</w:t>
+      </w:r>
+      <w:proofErr w:type="gramEnd"/>
+      <w:r>
+        <w:rPr>
+          <w:rFonts w:ascii="Times New Roman" w:hAnsi="Times New Roman"/>
+          <w:lang w:val="fr-FR"/>
+        </w:rPr>
+        <w:t xml:space="preserve"> dans l'appareil scientifique de ses prédécesseurs, dont il était plus facile de faire voir les défauts que de fixer exactement la valeur positive. </w:t>
       </w:r>
       <w:r>
         <w:rPr>
@@ -10997,6 +11367,7 @@
         </w:rPr>
         <w:tab/>
       </w:r>
+      <w:proofErr w:type="gramStart"/>
       <w:r>
         <w:rPr>
           <w:rFonts w:ascii="Times New Roman" w:hAnsi="Times New Roman"/>
@@ -11005,6 +11376,7 @@
         </w:rPr>
         <w:t>graveur</w:t>
       </w:r>
+      <w:proofErr w:type="gramEnd"/>
       <w:r>
         <w:rPr>
           <w:rFonts w:ascii="Times New Roman" w:hAnsi="Times New Roman"/>
@@ -11056,8 +11428,17 @@
           <w:lang w:val="fr-FR"/>
         </w:rPr>
         <w:tab/>
-        <w:t>Question : Qu'est-ce qui prouve que cet élément -eur est réellement isolé par une analyse de la langue?</w:t>
-      </w:r>
+        <w:t xml:space="preserve">Question : Qu'est-ce qui prouve que cet élément -eur est réellement isolé par une analyse de la </w:t>
+      </w:r>
+      <w:proofErr w:type="gramStart"/>
+      <w:r>
+        <w:rPr>
+          <w:rFonts w:ascii="Times New Roman" w:hAnsi="Times New Roman"/>
+          <w:lang w:val="fr-FR"/>
+        </w:rPr>
+        <w:t>langue?</w:t>
+      </w:r>
+      <w:proofErr w:type="gramEnd"/>
     </w:p>
     <w:p>
       <w:pPr>
@@ -11139,28 +11520,52 @@
           <w:lang w:val="fr-FR"/>
         </w:rPr>
       </w:pPr>
-      <w:r>
-        <w:rPr>
-          <w:rFonts w:ascii="Times New Roman" w:hAnsi="Times New Roman"/>
-          <w:lang w:val="fr-FR"/>
-        </w:rPr>
-        <w:t>la langue et sa manière de procéder trouvent à se manifester dans un document irrécusable :</w:t>
-      </w:r>
-    </w:p>
-    <w:p>
-      <w:pPr>
-        <w:rPr>
-          <w:rFonts w:ascii="Times New Roman" w:hAnsi="Times New Roman"/>
-          <w:lang w:val="fr-FR"/>
-        </w:rPr>
-      </w:pPr>
-      <w:r>
-        <w:rPr>
-          <w:rFonts w:ascii="Times New Roman" w:hAnsi="Times New Roman"/>
-          <w:lang w:val="fr-FR"/>
-        </w:rPr>
-        <w:tab/>
-        <w:t>men-eur, os-eur, recommenc-eur.</w:t>
+      <w:proofErr w:type="gramStart"/>
+      <w:r>
+        <w:rPr>
+          <w:rFonts w:ascii="Times New Roman" w:hAnsi="Times New Roman"/>
+          <w:lang w:val="fr-FR"/>
+        </w:rPr>
+        <w:t>la</w:t>
+      </w:r>
+      <w:proofErr w:type="gramEnd"/>
+      <w:r>
+        <w:rPr>
+          <w:rFonts w:ascii="Times New Roman" w:hAnsi="Times New Roman"/>
+          <w:lang w:val="fr-FR"/>
+        </w:rPr>
+        <w:t xml:space="preserve"> langue et sa manière de procéder trouvent à se manifester dans un document irrécusable :</w:t>
+      </w:r>
+    </w:p>
+    <w:p>
+      <w:pPr>
+        <w:rPr>
+          <w:rFonts w:ascii="Times New Roman" w:hAnsi="Times New Roman"/>
+          <w:lang w:val="fr-FR"/>
+        </w:rPr>
+      </w:pPr>
+      <w:r>
+        <w:rPr>
+          <w:rFonts w:ascii="Times New Roman" w:hAnsi="Times New Roman"/>
+          <w:lang w:val="fr-FR"/>
+        </w:rPr>
+        <w:tab/>
+      </w:r>
+      <w:proofErr w:type="gramStart"/>
+      <w:r>
+        <w:rPr>
+          <w:rFonts w:ascii="Times New Roman" w:hAnsi="Times New Roman"/>
+          <w:lang w:val="fr-FR"/>
+        </w:rPr>
+        <w:t>men</w:t>
+      </w:r>
+      <w:proofErr w:type="gramEnd"/>
+      <w:r>
+        <w:rPr>
+          <w:rFonts w:ascii="Times New Roman" w:hAnsi="Times New Roman"/>
+          <w:lang w:val="fr-FR"/>
+        </w:rPr>
+        <w:t>-eur, os-eur, recommenc-eur.</w:t>
       </w:r>
     </w:p>
     <w:p>
@@ -11231,12 +11636,21 @@
           <w:lang w:val="fr-FR"/>
         </w:rPr>
       </w:pPr>
-      <w:r>
-        <w:rPr>
-          <w:rFonts w:ascii="Times New Roman" w:hAnsi="Times New Roman"/>
-          <w:lang w:val="fr-FR"/>
-        </w:rPr>
-        <w:t xml:space="preserve">ne saurait passer pour un produit de l'abstraction. </w:t>
+      <w:proofErr w:type="gramStart"/>
+      <w:r>
+        <w:rPr>
+          <w:rFonts w:ascii="Times New Roman" w:hAnsi="Times New Roman"/>
+          <w:lang w:val="fr-FR"/>
+        </w:rPr>
+        <w:t>ne</w:t>
+      </w:r>
+      <w:proofErr w:type="gramEnd"/>
+      <w:r>
+        <w:rPr>
+          <w:rFonts w:ascii="Times New Roman" w:hAnsi="Times New Roman"/>
+          <w:lang w:val="fr-FR"/>
+        </w:rPr>
+        <w:t xml:space="preserve"> saurait passer pour un produit de l'abstraction. </w:t>
       </w:r>
     </w:p>
     <w:p>
@@ -11347,12 +11761,21 @@
           <w:lang w:val="fr-FR"/>
         </w:rPr>
       </w:pPr>
-      <w:r>
-        <w:rPr>
-          <w:rFonts w:ascii="Times New Roman" w:hAnsi="Times New Roman"/>
-          <w:lang w:val="fr-FR"/>
-        </w:rPr>
-        <w:t>graveur :graver, je grave = x : oser, j'ose. - x = oseur.</w:t>
+      <w:proofErr w:type="gramStart"/>
+      <w:r>
+        <w:rPr>
+          <w:rFonts w:ascii="Times New Roman" w:hAnsi="Times New Roman"/>
+          <w:lang w:val="fr-FR"/>
+        </w:rPr>
+        <w:t>graveur</w:t>
+      </w:r>
+      <w:proofErr w:type="gramEnd"/>
+      <w:r>
+        <w:rPr>
+          <w:rFonts w:ascii="Times New Roman" w:hAnsi="Times New Roman"/>
+          <w:lang w:val="fr-FR"/>
+        </w:rPr>
+        <w:t xml:space="preserve"> :graver, je grave = x : oser, j'ose. - x = oseur.</w:t>
       </w:r>
     </w:p>
     <w:p>
@@ -11448,6 +11871,7 @@
         </w:rPr>
         <w:t xml:space="preserve"> - </w:t>
       </w:r>
+      <w:proofErr w:type="gramStart"/>
       <w:r>
         <w:rPr>
           <w:rFonts w:ascii="Times New Roman" w:hAnsi="Times New Roman"/>
@@ -11459,38 +11883,46 @@
           <w:rFonts w:ascii="Times New Roman" w:hAnsi="Times New Roman"/>
           <w:lang w:val="fr-FR"/>
         </w:rPr>
+        <w:t xml:space="preserve"> :</w:t>
+      </w:r>
+      <w:proofErr w:type="gramEnd"/>
+      <w:r>
+        <w:rPr>
+          <w:rFonts w:ascii="Times New Roman" w:hAnsi="Times New Roman"/>
+          <w:lang w:val="fr-FR"/>
+        </w:rPr>
+        <w:t xml:space="preserve"> </w:t>
+      </w:r>
+      <w:r>
+        <w:rPr>
+          <w:rFonts w:ascii="Times New Roman" w:hAnsi="Times New Roman"/>
+        </w:rPr>
+        <w:t>δοτός</w:t>
+      </w:r>
+      <w:r>
+        <w:rPr>
+          <w:rFonts w:ascii="Times New Roman" w:hAnsi="Times New Roman"/>
+          <w:lang w:val="fr-FR"/>
+        </w:rPr>
+        <w:t xml:space="preserve"> = </w:t>
+      </w:r>
+      <w:r>
+        <w:rPr>
+          <w:rFonts w:ascii="Times New Roman" w:hAnsi="Times New Roman"/>
+        </w:rPr>
+        <w:t>στάσις</w:t>
+      </w:r>
+      <w:r>
+        <w:rPr>
+          <w:rFonts w:ascii="Times New Roman" w:hAnsi="Times New Roman"/>
+          <w:lang w:val="fr-FR"/>
+        </w:rPr>
         <w:t xml:space="preserve"> : </w:t>
       </w:r>
       <w:r>
         <w:rPr>
           <w:rFonts w:ascii="Times New Roman" w:hAnsi="Times New Roman"/>
         </w:rPr>
-        <w:t>δοτός</w:t>
-      </w:r>
-      <w:r>
-        <w:rPr>
-          <w:rFonts w:ascii="Times New Roman" w:hAnsi="Times New Roman"/>
-          <w:lang w:val="fr-FR"/>
-        </w:rPr>
-        <w:t xml:space="preserve"> = </w:t>
-      </w:r>
-      <w:r>
-        <w:rPr>
-          <w:rFonts w:ascii="Times New Roman" w:hAnsi="Times New Roman"/>
-        </w:rPr>
-        <w:t>στάσις</w:t>
-      </w:r>
-      <w:r>
-        <w:rPr>
-          <w:rFonts w:ascii="Times New Roman" w:hAnsi="Times New Roman"/>
-          <w:lang w:val="fr-FR"/>
-        </w:rPr>
-        <w:t xml:space="preserve"> : </w:t>
-      </w:r>
-      <w:r>
-        <w:rPr>
-          <w:rFonts w:ascii="Times New Roman" w:hAnsi="Times New Roman"/>
-        </w:rPr>
         <w:t>στατός</w:t>
       </w:r>
       <w:r>
@@ -11627,7 +12059,23 @@
           <w:rFonts w:ascii="Times New Roman" w:hAnsi="Times New Roman"/>
           <w:lang w:val="fr-FR"/>
         </w:rPr>
-        <w:t xml:space="preserve"> procède? graveur : graver = penseur :penser. Donc (oser) oseur.</w:t>
+        <w:t xml:space="preserve"> </w:t>
+      </w:r>
+      <w:proofErr w:type="gramStart"/>
+      <w:r>
+        <w:rPr>
+          <w:rFonts w:ascii="Times New Roman" w:hAnsi="Times New Roman"/>
+          <w:lang w:val="fr-FR"/>
+        </w:rPr>
+        <w:t>procède?</w:t>
+      </w:r>
+      <w:proofErr w:type="gramEnd"/>
+      <w:r>
+        <w:rPr>
+          <w:rFonts w:ascii="Times New Roman" w:hAnsi="Times New Roman"/>
+          <w:lang w:val="fr-FR"/>
+        </w:rPr>
+        <w:t xml:space="preserve"> graveur : graver = penseur :penser. Donc (oser) oseur.</w:t>
       </w:r>
     </w:p>
     <w:p>
@@ -11734,6 +12182,7 @@
         </w:rPr>
         <w:tab/>
       </w:r>
+      <w:proofErr w:type="gramStart"/>
       <w:r>
         <w:rPr>
           <w:rFonts w:ascii="Times New Roman" w:hAnsi="Times New Roman"/>
@@ -11741,6 +12190,7 @@
         </w:rPr>
         <w:t>kalb</w:t>
       </w:r>
+      <w:proofErr w:type="gramEnd"/>
       <w:r>
         <w:rPr>
           <w:rFonts w:ascii="Times New Roman" w:hAnsi="Times New Roman"/>
@@ -11834,37 +12284,71 @@
           <w:rFonts w:ascii="Times New Roman" w:hAnsi="Times New Roman"/>
           <w:lang w:val="fr-FR"/>
         </w:rPr>
-        <w:t xml:space="preserve">Une nécessité phonétique ayant accidentellement fait disparaître -iz. au singulier, tandis qu'il se maintenait au pluriel grâce à la protection de la voyelle qui suivait : or la langue- né jugeant jamais que par les formes, il est inévitable que la langue divise </w:t>
-      </w:r>
-    </w:p>
-    <w:p>
-      <w:pPr>
-        <w:rPr>
-          <w:rFonts w:ascii="Times New Roman" w:hAnsi="Times New Roman"/>
-          <w:lang w:val="fr-FR"/>
-        </w:rPr>
-      </w:pPr>
-      <w:r>
-        <w:rPr>
-          <w:rFonts w:ascii="Times New Roman" w:hAnsi="Times New Roman"/>
-          <w:lang w:val="fr-FR"/>
-        </w:rPr>
-        <w:t xml:space="preserve">kalb/ir </w:t>
-      </w:r>
-    </w:p>
-    <w:p>
-      <w:pPr>
-        <w:rPr>
-          <w:rFonts w:ascii="Times New Roman" w:hAnsi="Times New Roman"/>
-          <w:lang w:val="fr-FR"/>
-        </w:rPr>
-      </w:pPr>
-      <w:r>
-        <w:rPr>
-          <w:rFonts w:ascii="Times New Roman" w:hAnsi="Times New Roman"/>
-          <w:lang w:val="fr-FR"/>
-        </w:rPr>
-        <w:t>et prenne ir pour le signe du pluriel, tandis qu'à l'origine il n'avait rien de spécifiquement pluriel.</w:t>
+        <w:t xml:space="preserve">Une nécessité phonétique ayant accidentellement fait disparaître -iz. </w:t>
+      </w:r>
+      <w:proofErr w:type="gramStart"/>
+      <w:r>
+        <w:rPr>
+          <w:rFonts w:ascii="Times New Roman" w:hAnsi="Times New Roman"/>
+          <w:lang w:val="fr-FR"/>
+        </w:rPr>
+        <w:t>au</w:t>
+      </w:r>
+      <w:proofErr w:type="gramEnd"/>
+      <w:r>
+        <w:rPr>
+          <w:rFonts w:ascii="Times New Roman" w:hAnsi="Times New Roman"/>
+          <w:lang w:val="fr-FR"/>
+        </w:rPr>
+        <w:t xml:space="preserve"> singulier, tandis qu'il se maintenait au pluriel grâce à la protection de la voyelle qui suivait : or la langue- né jugeant jamais que par les formes, il est inévitable que la langue divise </w:t>
+      </w:r>
+    </w:p>
+    <w:p>
+      <w:pPr>
+        <w:rPr>
+          <w:rFonts w:ascii="Times New Roman" w:hAnsi="Times New Roman"/>
+          <w:lang w:val="fr-FR"/>
+        </w:rPr>
+      </w:pPr>
+      <w:proofErr w:type="gramStart"/>
+      <w:r>
+        <w:rPr>
+          <w:rFonts w:ascii="Times New Roman" w:hAnsi="Times New Roman"/>
+          <w:lang w:val="fr-FR"/>
+        </w:rPr>
+        <w:t>kalb</w:t>
+      </w:r>
+      <w:proofErr w:type="gramEnd"/>
+      <w:r>
+        <w:rPr>
+          <w:rFonts w:ascii="Times New Roman" w:hAnsi="Times New Roman"/>
+          <w:lang w:val="fr-FR"/>
+        </w:rPr>
+        <w:t xml:space="preserve">/ir </w:t>
+      </w:r>
+    </w:p>
+    <w:p>
+      <w:pPr>
+        <w:rPr>
+          <w:rFonts w:ascii="Times New Roman" w:hAnsi="Times New Roman"/>
+          <w:lang w:val="fr-FR"/>
+        </w:rPr>
+      </w:pPr>
+      <w:proofErr w:type="gramStart"/>
+      <w:r>
+        <w:rPr>
+          <w:rFonts w:ascii="Times New Roman" w:hAnsi="Times New Roman"/>
+          <w:lang w:val="fr-FR"/>
+        </w:rPr>
+        <w:t>et</w:t>
+      </w:r>
+      <w:proofErr w:type="gramEnd"/>
+      <w:r>
+        <w:rPr>
+          <w:rFonts w:ascii="Times New Roman" w:hAnsi="Times New Roman"/>
+          <w:lang w:val="fr-FR"/>
+        </w:rPr>
+        <w:t xml:space="preserve"> prenne ir pour le signe du pluriel, tandis qu'à l'origine il n'avait rien de spécifiquement pluriel.</w:t>
       </w:r>
     </w:p>
     <w:p>
@@ -11895,7 +12379,23 @@
           <w:lang w:val="fr-FR"/>
         </w:rPr>
         <w:tab/>
-        <w:t>Moralité : Une fois de plus, nous voyons que la morphologie ne peut jamais combiner et mêler plusieurs époques différentes; qu'elle doit exercer son activité séparément au sein de chaque époque, sous peine de confondre les faits phonétiques et les faits morphologiques. Je ne dis pas que ce ne soit pas un procédé courant, je dis que c'est un procédé détestable.</w:t>
+        <w:t xml:space="preserve">Moralité : Une fois de plus, nous voyons que la morphologie ne peut jamais combiner et mêler plusieurs époques </w:t>
+      </w:r>
+      <w:proofErr w:type="gramStart"/>
+      <w:r>
+        <w:rPr>
+          <w:rFonts w:ascii="Times New Roman" w:hAnsi="Times New Roman"/>
+          <w:lang w:val="fr-FR"/>
+        </w:rPr>
+        <w:t>différentes;</w:t>
+      </w:r>
+      <w:proofErr w:type="gramEnd"/>
+      <w:r>
+        <w:rPr>
+          <w:rFonts w:ascii="Times New Roman" w:hAnsi="Times New Roman"/>
+          <w:lang w:val="fr-FR"/>
+        </w:rPr>
+        <w:t xml:space="preserve"> qu'elle doit exercer son activité séparément au sein de chaque époque, sous peine de confondre les faits phonétiques et les faits morphologiques. Je ne dis pas que ce ne soit pas un procédé courant, je dis que c'est un procédé détestable.</w:t>
       </w:r>
     </w:p>
     <w:p>
@@ -12027,7 +12527,23 @@
           <w:rFonts w:ascii="Times New Roman" w:hAnsi="Times New Roman"/>
           <w:lang w:val="fr-FR"/>
         </w:rPr>
-        <w:t xml:space="preserve"> (S. Canc. ?)La méthode de l'analyse morphologique rétrospective ou de l'anachronie morphologique.</w:t>
+        <w:t xml:space="preserve"> (S. Canc. </w:t>
+      </w:r>
+      <w:proofErr w:type="gramStart"/>
+      <w:r>
+        <w:rPr>
+          <w:rFonts w:ascii="Times New Roman" w:hAnsi="Times New Roman"/>
+          <w:lang w:val="fr-FR"/>
+        </w:rPr>
+        <w:t>?)La</w:t>
+      </w:r>
+      <w:proofErr w:type="gramEnd"/>
+      <w:r>
+        <w:rPr>
+          <w:rFonts w:ascii="Times New Roman" w:hAnsi="Times New Roman"/>
+          <w:lang w:val="fr-FR"/>
+        </w:rPr>
+        <w:t xml:space="preserve"> méthode de l'analyse morphologique rétrospective ou de l'anachronie morphologique.</w:t>
       </w:r>
     </w:p>
     <w:p>
@@ -12059,12 +12575,21 @@
         </w:rPr>
         <w:tab/>
       </w:r>
-      <w:r>
-        <w:rPr>
-          <w:rFonts w:ascii="Times New Roman" w:hAnsi="Times New Roman"/>
-          <w:lang w:val="fr-FR"/>
-        </w:rPr>
-        <w:t>kalb kalbir</w:t>
+      <w:proofErr w:type="gramStart"/>
+      <w:r>
+        <w:rPr>
+          <w:rFonts w:ascii="Times New Roman" w:hAnsi="Times New Roman"/>
+          <w:lang w:val="fr-FR"/>
+        </w:rPr>
+        <w:t>kalb</w:t>
+      </w:r>
+      <w:proofErr w:type="gramEnd"/>
+      <w:r>
+        <w:rPr>
+          <w:rFonts w:ascii="Times New Roman" w:hAnsi="Times New Roman"/>
+          <w:lang w:val="fr-FR"/>
+        </w:rPr>
+        <w:t xml:space="preserve"> kalbir</w:t>
       </w:r>
     </w:p>
     <w:p>
@@ -12107,7 +12632,23 @@
           <w:rFonts w:ascii="Times New Roman" w:hAnsi="Times New Roman"/>
           <w:lang w:val="fr-FR"/>
         </w:rPr>
-        <w:t>, qu'est-ce que je fais? : de la morphologie protogermanique sur les f</w:t>
+        <w:t xml:space="preserve">, qu'est-ce que je </w:t>
+      </w:r>
+      <w:proofErr w:type="gramStart"/>
+      <w:r>
+        <w:rPr>
+          <w:rFonts w:ascii="Times New Roman" w:hAnsi="Times New Roman"/>
+          <w:lang w:val="fr-FR"/>
+        </w:rPr>
+        <w:t>fais?</w:t>
+      </w:r>
+      <w:proofErr w:type="gramEnd"/>
+      <w:r>
+        <w:rPr>
+          <w:rFonts w:ascii="Times New Roman" w:hAnsi="Times New Roman"/>
+          <w:lang w:val="fr-FR"/>
+        </w:rPr>
+        <w:t xml:space="preserve"> : de la morphologie protogermanique sur les f</w:t>
       </w:r>
       <w:r>
         <w:rPr>
@@ -12401,7 +12942,23 @@
           <w:rFonts w:ascii="Times New Roman" w:hAnsi="Times New Roman"/>
           <w:lang w:val="fr-FR"/>
         </w:rPr>
-        <w:t xml:space="preserve">La preuve? Comme toujours, les formations nouvelles ou analogiques : </w:t>
+        <w:t xml:space="preserve">La </w:t>
+      </w:r>
+      <w:proofErr w:type="gramStart"/>
+      <w:r>
+        <w:rPr>
+          <w:rFonts w:ascii="Times New Roman" w:hAnsi="Times New Roman"/>
+          <w:lang w:val="fr-FR"/>
+        </w:rPr>
+        <w:t>preuve?</w:t>
+      </w:r>
+      <w:proofErr w:type="gramEnd"/>
+      <w:r>
+        <w:rPr>
+          <w:rFonts w:ascii="Times New Roman" w:hAnsi="Times New Roman"/>
+          <w:lang w:val="fr-FR"/>
+        </w:rPr>
+        <w:t xml:space="preserve"> Comme toujours, les formations nouvelles ou analogiques : </w:t>
       </w:r>
       <w:r>
         <w:rPr>
@@ -12614,7 +13171,23 @@
           <w:rFonts w:ascii="Times New Roman" w:hAnsi="Times New Roman"/>
           <w:lang w:val="fr-FR"/>
         </w:rPr>
-        <w:t>licus sur villa . Néan</w:t>
+        <w:t xml:space="preserve">licus sur </w:t>
+      </w:r>
+      <w:proofErr w:type="gramStart"/>
+      <w:r>
+        <w:rPr>
+          <w:rFonts w:ascii="Times New Roman" w:hAnsi="Times New Roman"/>
+          <w:lang w:val="fr-FR"/>
+        </w:rPr>
+        <w:t>villa .</w:t>
+      </w:r>
+      <w:proofErr w:type="gramEnd"/>
+      <w:r>
+        <w:rPr>
+          <w:rFonts w:ascii="Times New Roman" w:hAnsi="Times New Roman"/>
+          <w:lang w:val="fr-FR"/>
+        </w:rPr>
+        <w:t xml:space="preserve"> Néan</w:t>
       </w:r>
       <w:r>
         <w:rPr>
@@ -12675,6 +13248,7 @@
           <w:lang w:val="fr-FR"/>
         </w:rPr>
       </w:pPr>
+      <w:proofErr w:type="gramStart"/>
       <w:r>
         <w:rPr>
           <w:rFonts w:ascii="Times New Roman" w:hAnsi="Times New Roman"/>
@@ -12689,6 +13263,7 @@
         </w:rPr>
         <w:t>ō</w:t>
       </w:r>
+      <w:proofErr w:type="gramEnd"/>
       <w:r>
         <w:rPr>
           <w:rFonts w:ascii="Times New Roman" w:hAnsi="Times New Roman"/>
@@ -12856,12 +13431,21 @@
           <w:lang w:val="fr-FR"/>
         </w:rPr>
       </w:pPr>
-      <w:r>
-        <w:rPr>
-          <w:rFonts w:ascii="Times New Roman" w:hAnsi="Times New Roman"/>
-          <w:lang w:val="fr-FR"/>
-        </w:rPr>
-        <w:t xml:space="preserve">au-delà du grec, et pour </w:t>
+      <w:proofErr w:type="gramStart"/>
+      <w:r>
+        <w:rPr>
+          <w:rFonts w:ascii="Times New Roman" w:hAnsi="Times New Roman"/>
+          <w:lang w:val="fr-FR"/>
+        </w:rPr>
+        <w:t>au</w:t>
+      </w:r>
+      <w:proofErr w:type="gramEnd"/>
+      <w:r>
+        <w:rPr>
+          <w:rFonts w:ascii="Times New Roman" w:hAnsi="Times New Roman"/>
+          <w:lang w:val="fr-FR"/>
+        </w:rPr>
+        <w:t xml:space="preserve">-delà du grec, et pour </w:t>
       </w:r>
       <w:r>
         <w:rPr>
@@ -13070,22 +13654,47 @@
           <w:rFonts w:ascii="Times New Roman" w:hAnsi="Times New Roman"/>
           <w:lang w:val="fr-FR"/>
         </w:rPr>
-        <w:t>ciale qui prend le nom de Morphologie historique. Elle sépare les époques et les compare, tandis que la morphologie rétrospective les confond. Elle nous présente la véritable perspective entre les classifications et les interprétations successives auxquelles la langue a pu se livrer sur. les mêmes formes, tandis que la morphologie rétrospective cherche, si</w:t>
-      </w:r>
-    </w:p>
-    <w:p>
-      <w:pPr>
-        <w:rPr>
-          <w:rFonts w:ascii="Times New Roman" w:hAnsi="Times New Roman"/>
-          <w:lang w:val="fr-FR"/>
-        </w:rPr>
-      </w:pPr>
-      <w:r>
-        <w:rPr>
-          <w:rFonts w:ascii="Times New Roman" w:hAnsi="Times New Roman"/>
-          <w:lang w:val="fr-FR"/>
-        </w:rPr>
-        <w:t>vous me permettez cette image, à obtenir la projection sur un même plan de classifications très différentes par leur date.</w:t>
+        <w:t xml:space="preserve">ciale qui prend le nom de Morphologie historique. Elle sépare les époques et les compare, tandis que la morphologie rétrospective les confond. Elle nous présente la véritable perspective entre les classifications et les interprétations successives auxquelles la langue a pu se livrer sur. </w:t>
+      </w:r>
+      <w:proofErr w:type="gramStart"/>
+      <w:r>
+        <w:rPr>
+          <w:rFonts w:ascii="Times New Roman" w:hAnsi="Times New Roman"/>
+          <w:lang w:val="fr-FR"/>
+        </w:rPr>
+        <w:t>les</w:t>
+      </w:r>
+      <w:proofErr w:type="gramEnd"/>
+      <w:r>
+        <w:rPr>
+          <w:rFonts w:ascii="Times New Roman" w:hAnsi="Times New Roman"/>
+          <w:lang w:val="fr-FR"/>
+        </w:rPr>
+        <w:t xml:space="preserve"> mêmes formes, tandis que la morphologie rétrospective cherche, si</w:t>
+      </w:r>
+    </w:p>
+    <w:p>
+      <w:pPr>
+        <w:rPr>
+          <w:rFonts w:ascii="Times New Roman" w:hAnsi="Times New Roman"/>
+          <w:lang w:val="fr-FR"/>
+        </w:rPr>
+      </w:pPr>
+      <w:proofErr w:type="gramStart"/>
+      <w:r>
+        <w:rPr>
+          <w:rFonts w:ascii="Times New Roman" w:hAnsi="Times New Roman"/>
+          <w:lang w:val="fr-FR"/>
+        </w:rPr>
+        <w:t>vous</w:t>
+      </w:r>
+      <w:proofErr w:type="gramEnd"/>
+      <w:r>
+        <w:rPr>
+          <w:rFonts w:ascii="Times New Roman" w:hAnsi="Times New Roman"/>
+          <w:lang w:val="fr-FR"/>
+        </w:rPr>
+        <w:t xml:space="preserve"> me permettez cette image, à obtenir la projection sur un même plan de classifications très différentes par leur date.</w:t>
       </w:r>
     </w:p>
     <w:p>
@@ -13266,8 +13875,17 @@
           <w:rFonts w:ascii="Times New Roman" w:hAnsi="Times New Roman"/>
           <w:lang w:val="fr-FR"/>
         </w:rPr>
-        <w:t>phologique qui s'accomplit d'une époque à l'autre?</w:t>
-      </w:r>
+        <w:t xml:space="preserve">phologique qui s'accomplit d'une époque à </w:t>
+      </w:r>
+      <w:proofErr w:type="gramStart"/>
+      <w:r>
+        <w:rPr>
+          <w:rFonts w:ascii="Times New Roman" w:hAnsi="Times New Roman"/>
+          <w:lang w:val="fr-FR"/>
+        </w:rPr>
+        <w:t>l'autre?</w:t>
+      </w:r>
+      <w:proofErr w:type="gramEnd"/>
     </w:p>
     <w:p>
       <w:pPr>
@@ -13837,7 +14455,23 @@
           <w:rFonts w:ascii="Times New Roman" w:hAnsi="Times New Roman"/>
           <w:lang w:val="fr-FR"/>
         </w:rPr>
-        <w:t>il fallait un modèle ;or, naturellement, ce modèle devait être très connu de celui qui lançait le néologisme; c'est dire que le fait s'est passé entre formes on ne peut plus con</w:t>
+        <w:t>il fallait un modèle</w:t>
+      </w:r>
+      <w:proofErr w:type="gramStart"/>
+      <w:r>
+        <w:rPr>
+          <w:rFonts w:ascii="Times New Roman" w:hAnsi="Times New Roman"/>
+          <w:lang w:val="fr-FR"/>
+        </w:rPr>
+        <w:t xml:space="preserve"> ;or</w:t>
+      </w:r>
+      <w:proofErr w:type="gramEnd"/>
+      <w:r>
+        <w:rPr>
+          <w:rFonts w:ascii="Times New Roman" w:hAnsi="Times New Roman"/>
+          <w:lang w:val="fr-FR"/>
+        </w:rPr>
+        <w:t>, naturellement, ce modèle devait être très connu de celui qui lançait le néologisme; c'est dire que le fait s'est passé entre formes on ne peut plus con</w:t>
       </w:r>
       <w:r>
         <w:rPr>
@@ -13941,8 +14575,17 @@
           <w:rFonts w:ascii="Times New Roman" w:hAnsi="Times New Roman"/>
           <w:lang w:val="fr-FR"/>
         </w:rPr>
-        <w:t>Autre exemple de changement consistant en une création nouvelle substituée à l'ancienne:</w:t>
-      </w:r>
+        <w:t xml:space="preserve">Autre exemple de changement consistant en une création nouvelle substituée à </w:t>
+      </w:r>
+      <w:proofErr w:type="gramStart"/>
+      <w:r>
+        <w:rPr>
+          <w:rFonts w:ascii="Times New Roman" w:hAnsi="Times New Roman"/>
+          <w:lang w:val="fr-FR"/>
+        </w:rPr>
+        <w:t>l'ancienne:</w:t>
+      </w:r>
+      <w:proofErr w:type="gramEnd"/>
     </w:p>
     <w:p>
       <w:pPr>
@@ -14370,6 +15013,7 @@
         </w:rPr>
         <w:t xml:space="preserve">'époque même de sa formation. - </w:t>
       </w:r>
+      <w:proofErr w:type="gramStart"/>
       <w:r>
         <w:rPr>
           <w:rFonts w:ascii="Times New Roman" w:hAnsi="Times New Roman" w:cs="Times New Roman"/>
@@ -14384,6 +15028,7 @@
         </w:rPr>
         <w:t>:</w:t>
       </w:r>
+      <w:proofErr w:type="gramEnd"/>
       <w:r>
         <w:rPr>
           <w:rFonts w:ascii="Times New Roman" w:hAnsi="Times New Roman" w:cs="Times New Roman"/>
@@ -14700,6 +15345,7 @@
           <w:lang w:val="fr-FR"/>
         </w:rPr>
       </w:pPr>
+      <w:proofErr w:type="gramStart"/>
       <w:r>
         <w:rPr>
           <w:rFonts w:ascii="Times New Roman" w:hAnsi="Times New Roman"/>
@@ -14707,6 +15353,7 @@
         </w:rPr>
         <w:t>k</w:t>
       </w:r>
+      <w:proofErr w:type="gramEnd"/>
       <w:r>
         <w:rPr>
           <w:rFonts w:ascii="Times New Roman" w:hAnsi="Times New Roman"/>
@@ -14745,6 +15392,7 @@
           <w:lang w:val="fr-FR"/>
         </w:rPr>
       </w:pPr>
+      <w:proofErr w:type="gramStart"/>
       <w:r>
         <w:rPr>
           <w:rFonts w:ascii="Times New Roman" w:hAnsi="Times New Roman"/>
@@ -14752,6 +15400,7 @@
         </w:rPr>
         <w:t>kwoteros</w:t>
       </w:r>
+      <w:proofErr w:type="gramEnd"/>
     </w:p>
     <w:p>
       <w:pPr>
@@ -14775,6 +15424,7 @@
           <w:lang w:val="fr-FR"/>
         </w:rPr>
       </w:pPr>
+      <w:proofErr w:type="gramStart"/>
       <w:r>
         <w:rPr>
           <w:rFonts w:ascii="Times New Roman" w:hAnsi="Times New Roman" w:cs="Times New Roman"/>
@@ -14782,6 +15432,7 @@
         </w:rPr>
         <w:t>πότερος</w:t>
       </w:r>
+      <w:proofErr w:type="gramEnd"/>
       <w:r>
         <w:rPr>
           <w:rFonts w:ascii="Times New Roman" w:hAnsi="Times New Roman"/>
@@ -14863,6 +15514,7 @@
           <w:lang w:val="fr-FR"/>
         </w:rPr>
       </w:pPr>
+      <w:proofErr w:type="gramStart"/>
       <w:r>
         <w:rPr>
           <w:rFonts w:ascii="Times New Roman" w:hAnsi="Times New Roman" w:cs="Times New Roman"/>
@@ -14870,6 +15522,7 @@
         </w:rPr>
         <w:t>τοί</w:t>
       </w:r>
+      <w:proofErr w:type="gramEnd"/>
       <w:r>
         <w:rPr>
           <w:rFonts w:ascii="Times New Roman" w:hAnsi="Times New Roman"/>
@@ -14950,6 +15603,7 @@
           <w:lang w:val="fr-FR"/>
         </w:rPr>
       </w:pPr>
+      <w:proofErr w:type="gramStart"/>
       <w:r>
         <w:rPr>
           <w:rFonts w:ascii="Times New Roman" w:hAnsi="Times New Roman" w:cs="Times New Roman"/>
@@ -14957,6 +15611,7 @@
         </w:rPr>
         <w:t>τοί</w:t>
       </w:r>
+      <w:proofErr w:type="gramEnd"/>
       <w:r>
         <w:rPr>
           <w:rFonts w:ascii="Times New Roman" w:hAnsi="Times New Roman"/>
@@ -14986,12 +15641,21 @@
           <w:lang w:val="fr-FR"/>
         </w:rPr>
       </w:pPr>
-      <w:r>
-        <w:rPr>
-          <w:rFonts w:ascii="Times New Roman" w:hAnsi="Times New Roman"/>
-          <w:lang w:val="fr-FR"/>
-        </w:rPr>
-        <w:t>car ce n'est évidemment pas le toi de la génération précédente</w:t>
+      <w:proofErr w:type="gramStart"/>
+      <w:r>
+        <w:rPr>
+          <w:rFonts w:ascii="Times New Roman" w:hAnsi="Times New Roman"/>
+          <w:lang w:val="fr-FR"/>
+        </w:rPr>
+        <w:t>car</w:t>
+      </w:r>
+      <w:proofErr w:type="gramEnd"/>
+      <w:r>
+        <w:rPr>
+          <w:rFonts w:ascii="Times New Roman" w:hAnsi="Times New Roman"/>
+          <w:lang w:val="fr-FR"/>
+        </w:rPr>
+        <w:t xml:space="preserve"> ce n'est évidemment pas le toi de la génération précédente</w:t>
       </w:r>
       <w:r>
         <w:rPr>
@@ -15029,12 +15693,21 @@
           <w:lang w:val="fr-FR"/>
         </w:rPr>
       </w:pPr>
-      <w:r>
-        <w:rPr>
-          <w:rFonts w:ascii="Times New Roman" w:hAnsi="Times New Roman"/>
-          <w:lang w:val="fr-FR"/>
-        </w:rPr>
-        <w:t>toi klut</w:t>
+      <w:proofErr w:type="gramStart"/>
+      <w:r>
+        <w:rPr>
+          <w:rFonts w:ascii="Times New Roman" w:hAnsi="Times New Roman"/>
+          <w:lang w:val="fr-FR"/>
+        </w:rPr>
+        <w:t>toi</w:t>
+      </w:r>
+      <w:proofErr w:type="gramEnd"/>
+      <w:r>
+        <w:rPr>
+          <w:rFonts w:ascii="Times New Roman" w:hAnsi="Times New Roman"/>
+          <w:lang w:val="fr-FR"/>
+        </w:rPr>
+        <w:t xml:space="preserve"> klut</w:t>
       </w:r>
       <w:r>
         <w:rPr>
@@ -15058,6 +15731,7 @@
           <w:lang w:val="fr-FR"/>
         </w:rPr>
       </w:pPr>
+      <w:proofErr w:type="gramStart"/>
       <w:r>
         <w:rPr>
           <w:rFonts w:ascii="Times New Roman" w:hAnsi="Times New Roman" w:cs="Times New Roman"/>
@@ -15065,6 +15739,7 @@
         </w:rPr>
         <w:t>τοί</w:t>
       </w:r>
+      <w:proofErr w:type="gramEnd"/>
       <w:r>
         <w:rPr>
           <w:rFonts w:ascii="Times New Roman" w:hAnsi="Times New Roman"/>

</xml_diff>